<commit_message>
docs: add team members (68160053, 68160203, 68160382)
</commit_message>
<xml_diff>
--- a/docs/Milestone1_BookLendingShop.docx
+++ b/docs/Milestone1_BookLendingShop.docx
@@ -241,7 +241,7 @@
                 <w:sz w:val="28"/>
                 <w:szCs w:val="28"/>
               </w:rPr>
-              <w:t xml:space="preserve">[...]</w:t>
+              <w:t xml:space="preserve">นายวัณณุวรรธน์ นพสมบูรณ์</w:t>
             </w:r>
           </w:p>
         </w:tc>
@@ -270,7 +270,7 @@
                 <w:sz w:val="28"/>
                 <w:szCs w:val="28"/>
               </w:rPr>
-              <w:t xml:space="preserve">[...]</w:t>
+              <w:t xml:space="preserve">68160053</w:t>
             </w:r>
           </w:p>
         </w:tc>
@@ -333,7 +333,7 @@
                 <w:sz w:val="28"/>
                 <w:szCs w:val="28"/>
               </w:rPr>
-              <w:t xml:space="preserve">[...]</w:t>
+              <w:t xml:space="preserve">นายภัทรพล เครือแตง</w:t>
             </w:r>
           </w:p>
         </w:tc>
@@ -362,7 +362,7 @@
                 <w:sz w:val="28"/>
                 <w:szCs w:val="28"/>
               </w:rPr>
-              <w:t xml:space="preserve">[...]</w:t>
+              <w:t xml:space="preserve">68160203</w:t>
             </w:r>
           </w:p>
         </w:tc>
@@ -425,7 +425,7 @@
                 <w:sz w:val="28"/>
                 <w:szCs w:val="28"/>
               </w:rPr>
-              <w:t xml:space="preserve">[...]</w:t>
+              <w:t xml:space="preserve">นายเตชินท์ หิมทอง</w:t>
             </w:r>
           </w:p>
         </w:tc>
@@ -454,7 +454,7 @@
                 <w:sz w:val="28"/>
                 <w:szCs w:val="28"/>
               </w:rPr>
-              <w:t xml:space="preserve">[...]</w:t>
+              <w:t xml:space="preserve">68160382</w:t>
             </w:r>
           </w:p>
         </w:tc>
@@ -500,21 +500,6 @@
           <w:szCs w:val="20"/>
         </w:rPr>
         <w:t xml:space="preserve">GitHub ของทีม: 68160053-hash, 68160203, 68160382-debug</w:t>
-      </w:r>
-    </w:p>
-    <w:p>
-      <w:pPr>
-        <w:spacing w:after="100"/>
-      </w:pPr>
-      <w:r>
-        <w:rPr>
-          <w:rFonts w:ascii="Leelawadee UI" w:cs="Leelawadee UI" w:eastAsia="Leelawadee UI" w:hAnsi="Leelawadee UI"/>
-          <w:b/>
-          <w:bCs/>
-          <w:sz w:val="20"/>
-          <w:szCs w:val="20"/>
-        </w:rPr>
-        <w:t xml:space="preserve">[ยังไม่ยืนยันจำนวนคน]</w:t>
       </w:r>
     </w:p>
     <w:p>
@@ -9146,7 +9131,7 @@
           <w:sz w:val="22"/>
           <w:szCs w:val="22"/>
         </w:rPr>
-        <w:t xml:space="preserve">การแบ่งงานเป็นข้อสมมติ 3 คน (ยังไม่ยืนยันจำนวนคนจริง): คนที่ 1 = หน้าเว็บ/UI, ความปลอดภัย, ประสานงานและ deploy; คนที่ 2 = ฐานข้อมูลและ CRUD หนังสือ; คนที่ 3 = ตรรกะยืม-คืน และร้านขาย</w:t>
+        <w:t xml:space="preserve">การแบ่งงาน: คนที่ 1 (วัณณุวรรธน์) = หน้าเว็บ/UI, ความปลอดภัย, ประสานงานและ deploy; คนที่ 2 (ภัทรพล) = ฐานข้อมูลและ CRUD หนังสือ; คนที่ 3 (เตชินท์) = ตรรกะยืม-คืน และร้านขาย</w:t>
       </w:r>
     </w:p>
     <w:tbl>
@@ -10585,7 +10570,7 @@
         </w:rPr>
         <w:t xml:space="preserve">GitHub: </w:t>
       </w:r>
-      <w:hyperlink w:history="1" r:id="rIdlabzky50izwoucwyv3ab_">
+      <w:hyperlink w:history="1" r:id="rIdh8vxcbfhyiasrk174xptf">
         <w:r>
           <w:rPr>
             <w:rFonts w:ascii="Leelawadee UI" w:cs="Leelawadee UI" w:eastAsia="Leelawadee UI" w:hAnsi="Leelawadee UI"/>
@@ -10615,7 +10600,7 @@
         </w:rPr>
         <w:t xml:space="preserve">ต้นแบบหน้าเว็บ: </w:t>
       </w:r>
-      <w:hyperlink w:history="1" r:id="rId4to4bhqtnqjzikwwzknfy">
+      <w:hyperlink w:history="1" r:id="rIdft6c2vffownaf2hxswaxr">
         <w:r>
           <w:rPr>
             <w:rFonts w:ascii="Leelawadee UI" w:cs="Leelawadee UI" w:eastAsia="Leelawadee UI" w:hAnsi="Leelawadee UI"/>

</xml_diff>